<commit_message>
damage types revamp and Heal your soul
</commit_message>
<xml_diff>
--- a/Docs/Augments.docx
+++ b/Docs/Augments.docx
@@ -42,7 +42,7 @@
           <w:sz w:val="21"/>
           <w:szCs w:val="21"/>
         </w:rPr>
-        <w:t xml:space="preserve">Dieses Dokument beschreibt alle 18 Augments, die aktuell im Augment-Pool liegen. Zu jedem Augment gibt es den Namen, eine Kurzzusammenfassung, den Text aus dem Augment-Panel und eine Tabelle mit den Werten, die das Augment beeinflusst.</w:t>
+        <w:t xml:space="preserve">Dieses Dokument beschreibt alle 19 Augments, die aktuell im Augment-Pool liegen. Zu jedem Augment gibt es den Namen, eine Kurzzusammenfassung, den Text aus dem Augment-Panel und eine Tabelle mit den Werten, die das Augment beeinflusst.</w:t>
       </w:r>
     </w:p>
     <w:p>
@@ -3173,7 +3173,7 @@
                 <w:sz w:val="19"/>
                 <w:szCs w:val="19"/>
               </w:rPr>
-              <w:t xml:space="preserve">Gegner mit einer Melee-Waffe getötet</w:t>
+              <w:t xml:space="preserve">Gegner mit einer Melee-Waffe getötet. Es zählt der Typ des tödlichen Treffers: Ranged, Ability und Effekte (z. B. Bleed) zählen nicht</w:t>
             </w:r>
           </w:p>
         </w:tc>
@@ -7733,7 +7733,7 @@
                 <w:sz w:val="19"/>
                 <w:szCs w:val="19"/>
               </w:rPr>
-              <w:t xml:space="preserve">Treffer</w:t>
+              <w:t xml:space="preserve">Waffentreffer</w:t>
             </w:r>
           </w:p>
         </w:tc>
@@ -7766,7 +7766,7 @@
                 <w:sz w:val="19"/>
                 <w:szCs w:val="19"/>
               </w:rPr>
-              <w:t xml:space="preserve">Jeder Treffer auf einen Gegner</w:t>
+              <w:t xml:space="preserve">Treffer mit einer Melee-, Ranged- oder Mystic-Waffe. Treffer von Abilities und Effekten (z. B. Bleed) zählen nicht</w:t>
             </w:r>
           </w:p>
         </w:tc>
@@ -7889,7 +7889,7 @@
         <w:rPr>
           <w:rFonts w:ascii="Arial" w:cs="Arial" w:eastAsia="Arial" w:hAnsi="Arial"/>
         </w:rPr>
-        <w:t xml:space="preserve">Infect &amp; Mutate: Blossom</w:t>
+        <w:t xml:space="preserve">Heal Your Soul</w:t>
       </w:r>
     </w:p>
     <w:p>
@@ -7900,7 +7900,7 @@
         <w:rPr>
           <w:rFonts w:ascii="Arial" w:cs="Arial" w:eastAsia="Arial" w:hAnsi="Arial"/>
         </w:rPr>
-        <w:t xml:space="preserve">Tauscht sich gegen zwei zufällige Blossom-Augments ein.</w:t>
+        <w:t xml:space="preserve">Jede Heilung schickt Energiestrahlen auf Gegner in der Nähe.</w:t>
       </w:r>
     </w:p>
     <w:p>
@@ -7970,7 +7970,7 @@
                 <w:sz w:val="21"/>
                 <w:szCs w:val="21"/>
               </w:rPr>
-              <w:t xml:space="preserve">Mutate this Augment into two random Blossom Augments</w:t>
+              <w:t xml:space="preserve">Upon healing, shoot malicious energy beams. Each dealing damage based on the healing value scaling with Mystic Damage</w:t>
             </w:r>
           </w:p>
         </w:tc>
@@ -8141,7 +8141,7 @@
                 <w:sz w:val="19"/>
                 <w:szCs w:val="19"/>
               </w:rPr>
-              <w:t xml:space="preserve">Erhaltene Augments</w:t>
+              <w:t xml:space="preserve">Auslöser</w:t>
             </w:r>
           </w:p>
         </w:tc>
@@ -8174,7 +8174,7 @@
                 <w:sz w:val="19"/>
                 <w:szCs w:val="19"/>
               </w:rPr>
-              <w:t xml:space="preserve">2 × Blossom</w:t>
+              <w:t xml:space="preserve">Heilung</w:t>
             </w:r>
           </w:p>
         </w:tc>
@@ -8207,7 +8207,7 @@
                 <w:sz w:val="19"/>
                 <w:szCs w:val="19"/>
               </w:rPr>
-              <w:t xml:space="preserve">Zufällig aus dem Augment-Pool. Sind weniger übrig, gibt es nur die übrigen</w:t>
+              <w:t xml:space="preserve">Jedes Mal, wenn der Spieler HP erhält (Heilung, Regeneration, Yin Yang). Heilungen im selben Frame werden zu einer Salve zusammengefasst</w:t>
             </w:r>
           </w:p>
         </w:tc>
@@ -8234,18 +8234,18 @@
           </w:tcPr>
           <w:p>
             <w:pPr>
-              <w:keepNext w:val="false"/>
-            </w:pPr>
-            <w:r>
-              <w:rPr>
-                <w:rFonts w:ascii="Arial" w:cs="Arial" w:eastAsia="Arial" w:hAnsi="Arial"/>
-                <w:b/>
-                <w:bCs/>
-                <w:color w:val="222222"/>
-                <w:sz w:val="19"/>
-                <w:szCs w:val="19"/>
-              </w:rPr>
-              <w:t xml:space="preserve">Ablauf</w:t>
+              <w:keepNext/>
+            </w:pPr>
+            <w:r>
+              <w:rPr>
+                <w:rFonts w:ascii="Arial" w:cs="Arial" w:eastAsia="Arial" w:hAnsi="Arial"/>
+                <w:b/>
+                <w:bCs/>
+                <w:color w:val="222222"/>
+                <w:sz w:val="19"/>
+                <w:szCs w:val="19"/>
+              </w:rPr>
+              <w:t xml:space="preserve">Reichweite</w:t>
             </w:r>
           </w:p>
         </w:tc>
@@ -8267,18 +8267,18 @@
           </w:tcPr>
           <w:p>
             <w:pPr>
-              <w:keepNext w:val="false"/>
-            </w:pPr>
-            <w:r>
-              <w:rPr>
-                <w:rFonts w:ascii="Arial" w:cs="Arial" w:eastAsia="Arial" w:hAnsi="Arial"/>
-                <w:b/>
-                <w:bCs/>
-                <w:color w:val="222222"/>
-                <w:sz w:val="19"/>
-                <w:szCs w:val="19"/>
-              </w:rPr>
-              <w:t xml:space="preserve">–</w:t>
+              <w:keepNext/>
+            </w:pPr>
+            <w:r>
+              <w:rPr>
+                <w:rFonts w:ascii="Arial" w:cs="Arial" w:eastAsia="Arial" w:hAnsi="Arial"/>
+                <w:b/>
+                <w:bCs/>
+                <w:color w:val="222222"/>
+                <w:sz w:val="19"/>
+                <w:szCs w:val="19"/>
+              </w:rPr>
+              <w:t xml:space="preserve">4</w:t>
             </w:r>
           </w:p>
         </w:tc>
@@ -8300,7 +8300,7 @@
           </w:tcPr>
           <w:p>
             <w:pPr>
-              <w:keepNext w:val="false"/>
+              <w:keepNext/>
             </w:pPr>
             <w:r>
               <w:rPr>
@@ -8311,7 +8311,527 @@
                 <w:sz w:val="19"/>
                 <w:szCs w:val="19"/>
               </w:rPr>
-              <w:t xml:space="preserve">Das Augment ersetzt sich selbst. Die neuen Augments werden aus dem Pool entfernt und bekommen den Titelzusatz „Infect and Mutate:“</w:t>
+              <w:t xml:space="preserve">Gegner in diesem Radius um den Spieler werden anvisiert</w:t>
+            </w:r>
+          </w:p>
+        </w:tc>
+      </w:tr>
+      <w:tr>
+        <w:trPr>
+          <w:cantSplit/>
+        </w:trPr>
+        <w:tc>
+          <w:tcPr>
+            <w:tcW w:type="dxa" w:w="2650"/>
+            <w:tcBorders>
+              <w:top w:val="single" w:color="BFC9CD" w:sz="4"/>
+              <w:left w:val="single" w:color="BFC9CD" w:sz="4"/>
+              <w:bottom w:val="single" w:color="BFC9CD" w:sz="4"/>
+              <w:right w:val="single" w:color="BFC9CD" w:sz="4"/>
+            </w:tcBorders>
+            <w:tcMar>
+              <w:top w:type="dxa" w:w="70"/>
+              <w:left w:type="dxa" w:w="110"/>
+              <w:bottom w:type="dxa" w:w="70"/>
+              <w:right w:type="dxa" w:w="110"/>
+            </w:tcMar>
+          </w:tcPr>
+          <w:p>
+            <w:pPr>
+              <w:keepNext/>
+            </w:pPr>
+            <w:r>
+              <w:rPr>
+                <w:rFonts w:ascii="Arial" w:cs="Arial" w:eastAsia="Arial" w:hAnsi="Arial"/>
+                <w:b/>
+                <w:bCs/>
+                <w:color w:val="222222"/>
+                <w:sz w:val="19"/>
+                <w:szCs w:val="19"/>
+              </w:rPr>
+              <w:t xml:space="preserve">Projektile</w:t>
+            </w:r>
+          </w:p>
+        </w:tc>
+        <w:tc>
+          <w:tcPr>
+            <w:tcW w:type="dxa" w:w="2450"/>
+            <w:tcBorders>
+              <w:top w:val="single" w:color="BFC9CD" w:sz="4"/>
+              <w:left w:val="single" w:color="BFC9CD" w:sz="4"/>
+              <w:bottom w:val="single" w:color="BFC9CD" w:sz="4"/>
+              <w:right w:val="single" w:color="BFC9CD" w:sz="4"/>
+            </w:tcBorders>
+            <w:tcMar>
+              <w:top w:type="dxa" w:w="70"/>
+              <w:left w:type="dxa" w:w="110"/>
+              <w:bottom w:type="dxa" w:w="70"/>
+              <w:right w:type="dxa" w:w="110"/>
+            </w:tcMar>
+          </w:tcPr>
+          <w:p>
+            <w:pPr>
+              <w:keepNext/>
+            </w:pPr>
+            <w:r>
+              <w:rPr>
+                <w:rFonts w:ascii="Arial" w:cs="Arial" w:eastAsia="Arial" w:hAnsi="Arial"/>
+                <w:b/>
+                <w:bCs/>
+                <w:color w:val="222222"/>
+                <w:sz w:val="19"/>
+                <w:szCs w:val="19"/>
+              </w:rPr>
+              <w:t xml:space="preserve">1 pro Gegner</w:t>
+            </w:r>
+          </w:p>
+        </w:tc>
+        <w:tc>
+          <w:tcPr>
+            <w:tcW w:type="dxa" w:w="4538"/>
+            <w:tcBorders>
+              <w:top w:val="single" w:color="BFC9CD" w:sz="4"/>
+              <w:left w:val="single" w:color="BFC9CD" w:sz="4"/>
+              <w:bottom w:val="single" w:color="BFC9CD" w:sz="4"/>
+              <w:right w:val="single" w:color="BFC9CD" w:sz="4"/>
+            </w:tcBorders>
+            <w:tcMar>
+              <w:top w:type="dxa" w:w="70"/>
+              <w:left w:type="dxa" w:w="110"/>
+              <w:bottom w:type="dxa" w:w="70"/>
+              <w:right w:type="dxa" w:w="110"/>
+            </w:tcMar>
+          </w:tcPr>
+          <w:p>
+            <w:pPr>
+              <w:keepNext/>
+            </w:pPr>
+            <w:r>
+              <w:rPr>
+                <w:rFonts w:ascii="Arial" w:cs="Arial" w:eastAsia="Arial" w:hAnsi="Arial"/>
+                <w:b w:val="false"/>
+                <w:bCs w:val="false"/>
+                <w:color w:val="222222"/>
+                <w:sz w:val="19"/>
+                <w:szCs w:val="19"/>
+              </w:rPr>
+              <w:t xml:space="preserve">Zielsuchende Projektile, jedes trifft nur sein Ziel</w:t>
+            </w:r>
+          </w:p>
+        </w:tc>
+      </w:tr>
+      <w:tr>
+        <w:trPr>
+          <w:cantSplit/>
+        </w:trPr>
+        <w:tc>
+          <w:tcPr>
+            <w:tcW w:type="dxa" w:w="2650"/>
+            <w:tcBorders>
+              <w:top w:val="single" w:color="BFC9CD" w:sz="4"/>
+              <w:left w:val="single" w:color="BFC9CD" w:sz="4"/>
+              <w:bottom w:val="single" w:color="BFC9CD" w:sz="4"/>
+              <w:right w:val="single" w:color="BFC9CD" w:sz="4"/>
+            </w:tcBorders>
+            <w:tcMar>
+              <w:top w:type="dxa" w:w="70"/>
+              <w:left w:type="dxa" w:w="110"/>
+              <w:bottom w:type="dxa" w:w="70"/>
+              <w:right w:type="dxa" w:w="110"/>
+            </w:tcMar>
+          </w:tcPr>
+          <w:p>
+            <w:pPr>
+              <w:keepNext/>
+            </w:pPr>
+            <w:r>
+              <w:rPr>
+                <w:rFonts w:ascii="Arial" w:cs="Arial" w:eastAsia="Arial" w:hAnsi="Arial"/>
+                <w:b/>
+                <w:bCs/>
+                <w:color w:val="222222"/>
+                <w:sz w:val="19"/>
+                <w:szCs w:val="19"/>
+              </w:rPr>
+              <w:t xml:space="preserve">Base Damage</w:t>
+            </w:r>
+          </w:p>
+        </w:tc>
+        <w:tc>
+          <w:tcPr>
+            <w:tcW w:type="dxa" w:w="2450"/>
+            <w:tcBorders>
+              <w:top w:val="single" w:color="BFC9CD" w:sz="4"/>
+              <w:left w:val="single" w:color="BFC9CD" w:sz="4"/>
+              <w:bottom w:val="single" w:color="BFC9CD" w:sz="4"/>
+              <w:right w:val="single" w:color="BFC9CD" w:sz="4"/>
+            </w:tcBorders>
+            <w:tcMar>
+              <w:top w:type="dxa" w:w="70"/>
+              <w:left w:type="dxa" w:w="110"/>
+              <w:bottom w:type="dxa" w:w="70"/>
+              <w:right w:type="dxa" w:w="110"/>
+            </w:tcMar>
+          </w:tcPr>
+          <w:p>
+            <w:pPr>
+              <w:keepNext/>
+            </w:pPr>
+            <w:r>
+              <w:rPr>
+                <w:rFonts w:ascii="Arial" w:cs="Arial" w:eastAsia="Arial" w:hAnsi="Arial"/>
+                <w:b/>
+                <w:bCs/>
+                <w:color w:val="222222"/>
+                <w:sz w:val="19"/>
+                <w:szCs w:val="19"/>
+              </w:rPr>
+              <w:t xml:space="preserve">= Heilwert</w:t>
+            </w:r>
+          </w:p>
+        </w:tc>
+        <w:tc>
+          <w:tcPr>
+            <w:tcW w:type="dxa" w:w="4538"/>
+            <w:tcBorders>
+              <w:top w:val="single" w:color="BFC9CD" w:sz="4"/>
+              <w:left w:val="single" w:color="BFC9CD" w:sz="4"/>
+              <w:bottom w:val="single" w:color="BFC9CD" w:sz="4"/>
+              <w:right w:val="single" w:color="BFC9CD" w:sz="4"/>
+            </w:tcBorders>
+            <w:tcMar>
+              <w:top w:type="dxa" w:w="70"/>
+              <w:left w:type="dxa" w:w="110"/>
+              <w:bottom w:type="dxa" w:w="70"/>
+              <w:right w:type="dxa" w:w="110"/>
+            </w:tcMar>
+          </w:tcPr>
+          <w:p>
+            <w:pPr>
+              <w:keepNext/>
+            </w:pPr>
+            <w:r>
+              <w:rPr>
+                <w:rFonts w:ascii="Arial" w:cs="Arial" w:eastAsia="Arial" w:hAnsi="Arial"/>
+                <w:b w:val="false"/>
+                <w:bCs w:val="false"/>
+                <w:color w:val="222222"/>
+                <w:sz w:val="19"/>
+                <w:szCs w:val="19"/>
+              </w:rPr>
+              <w:t xml:space="preserve">Der tatsächlich geheilte Betrag, inklusive Heal Power und Crit-Heal, ohne Überheilung</w:t>
+            </w:r>
+          </w:p>
+        </w:tc>
+      </w:tr>
+      <w:tr>
+        <w:trPr>
+          <w:cantSplit/>
+        </w:trPr>
+        <w:tc>
+          <w:tcPr>
+            <w:tcW w:type="dxa" w:w="2650"/>
+            <w:tcBorders>
+              <w:top w:val="single" w:color="BFC9CD" w:sz="4"/>
+              <w:left w:val="single" w:color="BFC9CD" w:sz="4"/>
+              <w:bottom w:val="single" w:color="BFC9CD" w:sz="4"/>
+              <w:right w:val="single" w:color="BFC9CD" w:sz="4"/>
+            </w:tcBorders>
+            <w:tcMar>
+              <w:top w:type="dxa" w:w="70"/>
+              <w:left w:type="dxa" w:w="110"/>
+              <w:bottom w:type="dxa" w:w="70"/>
+              <w:right w:type="dxa" w:w="110"/>
+            </w:tcMar>
+          </w:tcPr>
+          <w:p>
+            <w:pPr>
+              <w:keepNext/>
+            </w:pPr>
+            <w:r>
+              <w:rPr>
+                <w:rFonts w:ascii="Arial" w:cs="Arial" w:eastAsia="Arial" w:hAnsi="Arial"/>
+                <w:b/>
+                <w:bCs/>
+                <w:color w:val="222222"/>
+                <w:sz w:val="19"/>
+                <w:szCs w:val="19"/>
+              </w:rPr>
+              <w:t xml:space="preserve">Mystic Damage Skalierung</w:t>
+            </w:r>
+          </w:p>
+        </w:tc>
+        <w:tc>
+          <w:tcPr>
+            <w:tcW w:type="dxa" w:w="2450"/>
+            <w:tcBorders>
+              <w:top w:val="single" w:color="BFC9CD" w:sz="4"/>
+              <w:left w:val="single" w:color="BFC9CD" w:sz="4"/>
+              <w:bottom w:val="single" w:color="BFC9CD" w:sz="4"/>
+              <w:right w:val="single" w:color="BFC9CD" w:sz="4"/>
+            </w:tcBorders>
+            <w:tcMar>
+              <w:top w:type="dxa" w:w="70"/>
+              <w:left w:type="dxa" w:w="110"/>
+              <w:bottom w:type="dxa" w:w="70"/>
+              <w:right w:type="dxa" w:w="110"/>
+            </w:tcMar>
+          </w:tcPr>
+          <w:p>
+            <w:pPr>
+              <w:keepNext/>
+            </w:pPr>
+            <w:r>
+              <w:rPr>
+                <w:rFonts w:ascii="Arial" w:cs="Arial" w:eastAsia="Arial" w:hAnsi="Arial"/>
+                <w:b/>
+                <w:bCs/>
+                <w:color w:val="222222"/>
+                <w:sz w:val="19"/>
+                <w:szCs w:val="19"/>
+              </w:rPr>
+              <w:t xml:space="preserve">100 %</w:t>
+            </w:r>
+          </w:p>
+        </w:tc>
+        <w:tc>
+          <w:tcPr>
+            <w:tcW w:type="dxa" w:w="4538"/>
+            <w:tcBorders>
+              <w:top w:val="single" w:color="BFC9CD" w:sz="4"/>
+              <w:left w:val="single" w:color="BFC9CD" w:sz="4"/>
+              <w:bottom w:val="single" w:color="BFC9CD" w:sz="4"/>
+              <w:right w:val="single" w:color="BFC9CD" w:sz="4"/>
+            </w:tcBorders>
+            <w:tcMar>
+              <w:top w:type="dxa" w:w="70"/>
+              <w:left w:type="dxa" w:w="110"/>
+              <w:bottom w:type="dxa" w:w="70"/>
+              <w:right w:type="dxa" w:w="110"/>
+            </w:tcMar>
+          </w:tcPr>
+          <w:p>
+            <w:pPr>
+              <w:keepNext/>
+            </w:pPr>
+            <w:r>
+              <w:rPr>
+                <w:rFonts w:ascii="Arial" w:cs="Arial" w:eastAsia="Arial" w:hAnsi="Arial"/>
+                <w:b w:val="false"/>
+                <w:bCs w:val="false"/>
+                <w:color w:val="222222"/>
+                <w:sz w:val="19"/>
+                <w:szCs w:val="19"/>
+              </w:rPr>
+              <w:t xml:space="preserve">Schadensart Mystic, Waffentyp Ability. Melee- und Ranged-Skalierung sind 0</w:t>
+            </w:r>
+          </w:p>
+        </w:tc>
+      </w:tr>
+      <w:tr>
+        <w:trPr>
+          <w:cantSplit/>
+        </w:trPr>
+        <w:tc>
+          <w:tcPr>
+            <w:tcW w:type="dxa" w:w="2650"/>
+            <w:tcBorders>
+              <w:top w:val="single" w:color="BFC9CD" w:sz="4"/>
+              <w:left w:val="single" w:color="BFC9CD" w:sz="4"/>
+              <w:bottom w:val="single" w:color="BFC9CD" w:sz="4"/>
+              <w:right w:val="single" w:color="BFC9CD" w:sz="4"/>
+            </w:tcBorders>
+            <w:tcMar>
+              <w:top w:type="dxa" w:w="70"/>
+              <w:left w:type="dxa" w:w="110"/>
+              <w:bottom w:type="dxa" w:w="70"/>
+              <w:right w:type="dxa" w:w="110"/>
+            </w:tcMar>
+          </w:tcPr>
+          <w:p>
+            <w:pPr>
+              <w:keepNext/>
+            </w:pPr>
+            <w:r>
+              <w:rPr>
+                <w:rFonts w:ascii="Arial" w:cs="Arial" w:eastAsia="Arial" w:hAnsi="Arial"/>
+                <w:b/>
+                <w:bCs/>
+                <w:color w:val="222222"/>
+                <w:sz w:val="19"/>
+                <w:szCs w:val="19"/>
+              </w:rPr>
+              <w:t xml:space="preserve">Kritischer Treffer</w:t>
+            </w:r>
+          </w:p>
+        </w:tc>
+        <w:tc>
+          <w:tcPr>
+            <w:tcW w:type="dxa" w:w="2450"/>
+            <w:tcBorders>
+              <w:top w:val="single" w:color="BFC9CD" w:sz="4"/>
+              <w:left w:val="single" w:color="BFC9CD" w:sz="4"/>
+              <w:bottom w:val="single" w:color="BFC9CD" w:sz="4"/>
+              <w:right w:val="single" w:color="BFC9CD" w:sz="4"/>
+            </w:tcBorders>
+            <w:tcMar>
+              <w:top w:type="dxa" w:w="70"/>
+              <w:left w:type="dxa" w:w="110"/>
+              <w:bottom w:type="dxa" w:w="70"/>
+              <w:right w:type="dxa" w:w="110"/>
+            </w:tcMar>
+          </w:tcPr>
+          <w:p>
+            <w:pPr>
+              <w:keepNext/>
+            </w:pPr>
+            <w:r>
+              <w:rPr>
+                <w:rFonts w:ascii="Arial" w:cs="Arial" w:eastAsia="Arial" w:hAnsi="Arial"/>
+                <w:b/>
+                <w:bCs/>
+                <w:color w:val="222222"/>
+                <w:sz w:val="19"/>
+                <w:szCs w:val="19"/>
+              </w:rPr>
+              <w:t xml:space="preserve">nein</w:t>
+            </w:r>
+          </w:p>
+        </w:tc>
+        <w:tc>
+          <w:tcPr>
+            <w:tcW w:type="dxa" w:w="4538"/>
+            <w:tcBorders>
+              <w:top w:val="single" w:color="BFC9CD" w:sz="4"/>
+              <w:left w:val="single" w:color="BFC9CD" w:sz="4"/>
+              <w:bottom w:val="single" w:color="BFC9CD" w:sz="4"/>
+              <w:right w:val="single" w:color="BFC9CD" w:sz="4"/>
+            </w:tcBorders>
+            <w:tcMar>
+              <w:top w:type="dxa" w:w="70"/>
+              <w:left w:type="dxa" w:w="110"/>
+              <w:bottom w:type="dxa" w:w="70"/>
+              <w:right w:type="dxa" w:w="110"/>
+            </w:tcMar>
+          </w:tcPr>
+          <w:p>
+            <w:pPr>
+              <w:keepNext/>
+            </w:pPr>
+            <w:r>
+              <w:rPr>
+                <w:rFonts w:ascii="Arial" w:cs="Arial" w:eastAsia="Arial" w:hAnsi="Arial"/>
+                <w:b w:val="false"/>
+                <w:bCs w:val="false"/>
+                <w:color w:val="222222"/>
+                <w:sz w:val="19"/>
+                <w:szCs w:val="19"/>
+              </w:rPr>
+              <w:t xml:space="preserve">Der Schaden kann nicht kritisch treffen</w:t>
+            </w:r>
+          </w:p>
+        </w:tc>
+      </w:tr>
+      <w:tr>
+        <w:trPr>
+          <w:cantSplit/>
+        </w:trPr>
+        <w:tc>
+          <w:tcPr>
+            <w:tcW w:type="dxa" w:w="2650"/>
+            <w:tcBorders>
+              <w:top w:val="single" w:color="BFC9CD" w:sz="4"/>
+              <w:left w:val="single" w:color="BFC9CD" w:sz="4"/>
+              <w:bottom w:val="single" w:color="BFC9CD" w:sz="4"/>
+              <w:right w:val="single" w:color="BFC9CD" w:sz="4"/>
+            </w:tcBorders>
+            <w:tcMar>
+              <w:top w:type="dxa" w:w="70"/>
+              <w:left w:type="dxa" w:w="110"/>
+              <w:bottom w:type="dxa" w:w="70"/>
+              <w:right w:type="dxa" w:w="110"/>
+            </w:tcMar>
+          </w:tcPr>
+          <w:p>
+            <w:pPr>
+              <w:keepNext w:val="false"/>
+            </w:pPr>
+            <w:r>
+              <w:rPr>
+                <w:rFonts w:ascii="Arial" w:cs="Arial" w:eastAsia="Arial" w:hAnsi="Arial"/>
+                <w:b/>
+                <w:bCs/>
+                <w:color w:val="222222"/>
+                <w:sz w:val="19"/>
+                <w:szCs w:val="19"/>
+              </w:rPr>
+              <w:t xml:space="preserve">Heilung durch Treffer</w:t>
+            </w:r>
+          </w:p>
+        </w:tc>
+        <w:tc>
+          <w:tcPr>
+            <w:tcW w:type="dxa" w:w="2450"/>
+            <w:tcBorders>
+              <w:top w:val="single" w:color="BFC9CD" w:sz="4"/>
+              <w:left w:val="single" w:color="BFC9CD" w:sz="4"/>
+              <w:bottom w:val="single" w:color="BFC9CD" w:sz="4"/>
+              <w:right w:val="single" w:color="BFC9CD" w:sz="4"/>
+            </w:tcBorders>
+            <w:tcMar>
+              <w:top w:type="dxa" w:w="70"/>
+              <w:left w:type="dxa" w:w="110"/>
+              <w:bottom w:type="dxa" w:w="70"/>
+              <w:right w:type="dxa" w:w="110"/>
+            </w:tcMar>
+          </w:tcPr>
+          <w:p>
+            <w:pPr>
+              <w:keepNext w:val="false"/>
+            </w:pPr>
+            <w:r>
+              <w:rPr>
+                <w:rFonts w:ascii="Arial" w:cs="Arial" w:eastAsia="Arial" w:hAnsi="Arial"/>
+                <w:b/>
+                <w:bCs/>
+                <w:color w:val="222222"/>
+                <w:sz w:val="19"/>
+                <w:szCs w:val="19"/>
+              </w:rPr>
+              <w:t xml:space="preserve">Spellvamp</w:t>
+            </w:r>
+          </w:p>
+        </w:tc>
+        <w:tc>
+          <w:tcPr>
+            <w:tcW w:type="dxa" w:w="4538"/>
+            <w:tcBorders>
+              <w:top w:val="single" w:color="BFC9CD" w:sz="4"/>
+              <w:left w:val="single" w:color="BFC9CD" w:sz="4"/>
+              <w:bottom w:val="single" w:color="BFC9CD" w:sz="4"/>
+              <w:right w:val="single" w:color="BFC9CD" w:sz="4"/>
+            </w:tcBorders>
+            <w:tcMar>
+              <w:top w:type="dxa" w:w="70"/>
+              <w:left w:type="dxa" w:w="110"/>
+              <w:bottom w:type="dxa" w:w="70"/>
+              <w:right w:type="dxa" w:w="110"/>
+            </w:tcMar>
+          </w:tcPr>
+          <w:p>
+            <w:pPr>
+              <w:keepNext w:val="false"/>
+            </w:pPr>
+            <w:r>
+              <w:rPr>
+                <w:rFonts w:ascii="Arial" w:cs="Arial" w:eastAsia="Arial" w:hAnsi="Arial"/>
+                <w:b w:val="false"/>
+                <w:bCs w:val="false"/>
+                <w:color w:val="222222"/>
+                <w:sz w:val="19"/>
+                <w:szCs w:val="19"/>
+              </w:rPr>
+              <w:t xml:space="preserve">Die Treffer würfeln Spellvamp (Spieler + Waffe, Standard 0), nie Lifesteal</w:t>
             </w:r>
           </w:p>
         </w:tc>
@@ -8330,7 +8850,7 @@
         <w:rPr>
           <w:rFonts w:ascii="Arial" w:cs="Arial" w:eastAsia="Arial" w:hAnsi="Arial"/>
         </w:rPr>
-        <w:t xml:space="preserve">Master of Trifactor</w:t>
+        <w:t xml:space="preserve">Infect &amp; Mutate: Blossom</w:t>
       </w:r>
     </w:p>
     <w:p>
@@ -8341,7 +8861,7 @@
         <w:rPr>
           <w:rFonts w:ascii="Arial" w:cs="Arial" w:eastAsia="Arial" w:hAnsi="Arial"/>
         </w:rPr>
-        <w:t xml:space="preserve">Jeder Treffer stärkt die beiden anderen Schadensarten.</w:t>
+        <w:t xml:space="preserve">Tauscht sich gegen zwei zufällige Blossom-Augments ein.</w:t>
       </w:r>
     </w:p>
     <w:p>
@@ -8411,7 +8931,7 @@
                 <w:sz w:val="21"/>
                 <w:szCs w:val="21"/>
               </w:rPr>
-              <w:t xml:space="preserve">Gain infinitely stacking melee, mystic and ranged damage, depending on weapon type. Stacks infinitely. Resets each round</w:t>
+              <w:t xml:space="preserve">Mutate this Augment into two random Blossom Augments</w:t>
             </w:r>
           </w:p>
         </w:tc>
@@ -8582,7 +9102,7 @@
                 <w:sz w:val="19"/>
                 <w:szCs w:val="19"/>
               </w:rPr>
-              <w:t xml:space="preserve">Melee Damage</w:t>
+              <w:t xml:space="preserve">Erhaltene Augments</w:t>
             </w:r>
           </w:p>
         </w:tc>
@@ -8615,7 +9135,7 @@
                 <w:sz w:val="19"/>
                 <w:szCs w:val="19"/>
               </w:rPr>
-              <w:t xml:space="preserve">+1 pro Stack</w:t>
+              <w:t xml:space="preserve">2 × Blossom</w:t>
             </w:r>
           </w:p>
         </w:tc>
@@ -8648,7 +9168,7 @@
                 <w:sz w:val="19"/>
                 <w:szCs w:val="19"/>
               </w:rPr>
-              <w:t xml:space="preserve">Bei Treffern mit einer Ranged- oder Mystic-Waffe</w:t>
+              <w:t xml:space="preserve">Zufällig aus dem Augment-Pool. Sind weniger übrig, gibt es nur die übrigen</w:t>
             </w:r>
           </w:p>
         </w:tc>
@@ -8675,18 +9195,18 @@
           </w:tcPr>
           <w:p>
             <w:pPr>
-              <w:keepNext/>
-            </w:pPr>
-            <w:r>
-              <w:rPr>
-                <w:rFonts w:ascii="Arial" w:cs="Arial" w:eastAsia="Arial" w:hAnsi="Arial"/>
-                <w:b/>
-                <w:bCs/>
-                <w:color w:val="222222"/>
-                <w:sz w:val="19"/>
-                <w:szCs w:val="19"/>
-              </w:rPr>
-              <w:t xml:space="preserve">Ranged Damage</w:t>
+              <w:keepNext w:val="false"/>
+            </w:pPr>
+            <w:r>
+              <w:rPr>
+                <w:rFonts w:ascii="Arial" w:cs="Arial" w:eastAsia="Arial" w:hAnsi="Arial"/>
+                <w:b/>
+                <w:bCs/>
+                <w:color w:val="222222"/>
+                <w:sz w:val="19"/>
+                <w:szCs w:val="19"/>
+              </w:rPr>
+              <w:t xml:space="preserve">Ablauf</w:t>
             </w:r>
           </w:p>
         </w:tc>
@@ -8708,18 +9228,18 @@
           </w:tcPr>
           <w:p>
             <w:pPr>
-              <w:keepNext/>
-            </w:pPr>
-            <w:r>
-              <w:rPr>
-                <w:rFonts w:ascii="Arial" w:cs="Arial" w:eastAsia="Arial" w:hAnsi="Arial"/>
-                <w:b/>
-                <w:bCs/>
-                <w:color w:val="222222"/>
-                <w:sz w:val="19"/>
-                <w:szCs w:val="19"/>
-              </w:rPr>
-              <w:t xml:space="preserve">+1 pro Stack</w:t>
+              <w:keepNext w:val="false"/>
+            </w:pPr>
+            <w:r>
+              <w:rPr>
+                <w:rFonts w:ascii="Arial" w:cs="Arial" w:eastAsia="Arial" w:hAnsi="Arial"/>
+                <w:b/>
+                <w:bCs/>
+                <w:color w:val="222222"/>
+                <w:sz w:val="19"/>
+                <w:szCs w:val="19"/>
+              </w:rPr>
+              <w:t xml:space="preserve">–</w:t>
             </w:r>
           </w:p>
         </w:tc>
@@ -8741,7 +9261,7 @@
           </w:tcPr>
           <w:p>
             <w:pPr>
-              <w:keepNext/>
+              <w:keepNext w:val="false"/>
             </w:pPr>
             <w:r>
               <w:rPr>
@@ -8752,215 +9272,7 @@
                 <w:sz w:val="19"/>
                 <w:szCs w:val="19"/>
               </w:rPr>
-              <w:t xml:space="preserve">Bei Treffern mit einer Melee- oder Mystic-Waffe</w:t>
-            </w:r>
-          </w:p>
-        </w:tc>
-      </w:tr>
-      <w:tr>
-        <w:trPr>
-          <w:cantSplit/>
-        </w:trPr>
-        <w:tc>
-          <w:tcPr>
-            <w:tcW w:type="dxa" w:w="2650"/>
-            <w:tcBorders>
-              <w:top w:val="single" w:color="BFC9CD" w:sz="4"/>
-              <w:left w:val="single" w:color="BFC9CD" w:sz="4"/>
-              <w:bottom w:val="single" w:color="BFC9CD" w:sz="4"/>
-              <w:right w:val="single" w:color="BFC9CD" w:sz="4"/>
-            </w:tcBorders>
-            <w:tcMar>
-              <w:top w:type="dxa" w:w="70"/>
-              <w:left w:type="dxa" w:w="110"/>
-              <w:bottom w:type="dxa" w:w="70"/>
-              <w:right w:type="dxa" w:w="110"/>
-            </w:tcMar>
-          </w:tcPr>
-          <w:p>
-            <w:pPr>
-              <w:keepNext/>
-            </w:pPr>
-            <w:r>
-              <w:rPr>
-                <w:rFonts w:ascii="Arial" w:cs="Arial" w:eastAsia="Arial" w:hAnsi="Arial"/>
-                <w:b/>
-                <w:bCs/>
-                <w:color w:val="222222"/>
-                <w:sz w:val="19"/>
-                <w:szCs w:val="19"/>
-              </w:rPr>
-              <w:t xml:space="preserve">Mystic Damage</w:t>
-            </w:r>
-          </w:p>
-        </w:tc>
-        <w:tc>
-          <w:tcPr>
-            <w:tcW w:type="dxa" w:w="2450"/>
-            <w:tcBorders>
-              <w:top w:val="single" w:color="BFC9CD" w:sz="4"/>
-              <w:left w:val="single" w:color="BFC9CD" w:sz="4"/>
-              <w:bottom w:val="single" w:color="BFC9CD" w:sz="4"/>
-              <w:right w:val="single" w:color="BFC9CD" w:sz="4"/>
-            </w:tcBorders>
-            <w:tcMar>
-              <w:top w:type="dxa" w:w="70"/>
-              <w:left w:type="dxa" w:w="110"/>
-              <w:bottom w:type="dxa" w:w="70"/>
-              <w:right w:type="dxa" w:w="110"/>
-            </w:tcMar>
-          </w:tcPr>
-          <w:p>
-            <w:pPr>
-              <w:keepNext/>
-            </w:pPr>
-            <w:r>
-              <w:rPr>
-                <w:rFonts w:ascii="Arial" w:cs="Arial" w:eastAsia="Arial" w:hAnsi="Arial"/>
-                <w:b/>
-                <w:bCs/>
-                <w:color w:val="222222"/>
-                <w:sz w:val="19"/>
-                <w:szCs w:val="19"/>
-              </w:rPr>
-              <w:t xml:space="preserve">+1 pro Stack</w:t>
-            </w:r>
-          </w:p>
-        </w:tc>
-        <w:tc>
-          <w:tcPr>
-            <w:tcW w:type="dxa" w:w="4538"/>
-            <w:tcBorders>
-              <w:top w:val="single" w:color="BFC9CD" w:sz="4"/>
-              <w:left w:val="single" w:color="BFC9CD" w:sz="4"/>
-              <w:bottom w:val="single" w:color="BFC9CD" w:sz="4"/>
-              <w:right w:val="single" w:color="BFC9CD" w:sz="4"/>
-            </w:tcBorders>
-            <w:tcMar>
-              <w:top w:type="dxa" w:w="70"/>
-              <w:left w:type="dxa" w:w="110"/>
-              <w:bottom w:type="dxa" w:w="70"/>
-              <w:right w:type="dxa" w:w="110"/>
-            </w:tcMar>
-          </w:tcPr>
-          <w:p>
-            <w:pPr>
-              <w:keepNext/>
-            </w:pPr>
-            <w:r>
-              <w:rPr>
-                <w:rFonts w:ascii="Arial" w:cs="Arial" w:eastAsia="Arial" w:hAnsi="Arial"/>
-                <w:b w:val="false"/>
-                <w:bCs w:val="false"/>
-                <w:color w:val="222222"/>
-                <w:sz w:val="19"/>
-                <w:szCs w:val="19"/>
-              </w:rPr>
-              <w:t xml:space="preserve">Bei Treffern mit einer Melee- oder Ranged-Waffe</w:t>
-            </w:r>
-          </w:p>
-        </w:tc>
-      </w:tr>
-      <w:tr>
-        <w:trPr>
-          <w:cantSplit/>
-        </w:trPr>
-        <w:tc>
-          <w:tcPr>
-            <w:tcW w:type="dxa" w:w="2650"/>
-            <w:tcBorders>
-              <w:top w:val="single" w:color="BFC9CD" w:sz="4"/>
-              <w:left w:val="single" w:color="BFC9CD" w:sz="4"/>
-              <w:bottom w:val="single" w:color="BFC9CD" w:sz="4"/>
-              <w:right w:val="single" w:color="BFC9CD" w:sz="4"/>
-            </w:tcBorders>
-            <w:tcMar>
-              <w:top w:type="dxa" w:w="70"/>
-              <w:left w:type="dxa" w:w="110"/>
-              <w:bottom w:type="dxa" w:w="70"/>
-              <w:right w:type="dxa" w:w="110"/>
-            </w:tcMar>
-          </w:tcPr>
-          <w:p>
-            <w:pPr>
-              <w:keepNext w:val="false"/>
-            </w:pPr>
-            <w:r>
-              <w:rPr>
-                <w:rFonts w:ascii="Arial" w:cs="Arial" w:eastAsia="Arial" w:hAnsi="Arial"/>
-                <w:b/>
-                <w:bCs/>
-                <w:color w:val="222222"/>
-                <w:sz w:val="19"/>
-                <w:szCs w:val="19"/>
-              </w:rPr>
-              <w:t xml:space="preserve">Stack-Limit</w:t>
-            </w:r>
-          </w:p>
-        </w:tc>
-        <w:tc>
-          <w:tcPr>
-            <w:tcW w:type="dxa" w:w="2450"/>
-            <w:tcBorders>
-              <w:top w:val="single" w:color="BFC9CD" w:sz="4"/>
-              <w:left w:val="single" w:color="BFC9CD" w:sz="4"/>
-              <w:bottom w:val="single" w:color="BFC9CD" w:sz="4"/>
-              <w:right w:val="single" w:color="BFC9CD" w:sz="4"/>
-            </w:tcBorders>
-            <w:tcMar>
-              <w:top w:type="dxa" w:w="70"/>
-              <w:left w:type="dxa" w:w="110"/>
-              <w:bottom w:type="dxa" w:w="70"/>
-              <w:right w:type="dxa" w:w="110"/>
-            </w:tcMar>
-          </w:tcPr>
-          <w:p>
-            <w:pPr>
-              <w:keepNext w:val="false"/>
-            </w:pPr>
-            <w:r>
-              <w:rPr>
-                <w:rFonts w:ascii="Arial" w:cs="Arial" w:eastAsia="Arial" w:hAnsi="Arial"/>
-                <w:b/>
-                <w:bCs/>
-                <w:color w:val="222222"/>
-                <w:sz w:val="19"/>
-                <w:szCs w:val="19"/>
-              </w:rPr>
-              <w:t xml:space="preserve">unbegrenzt</w:t>
-            </w:r>
-          </w:p>
-        </w:tc>
-        <w:tc>
-          <w:tcPr>
-            <w:tcW w:type="dxa" w:w="4538"/>
-            <w:tcBorders>
-              <w:top w:val="single" w:color="BFC9CD" w:sz="4"/>
-              <w:left w:val="single" w:color="BFC9CD" w:sz="4"/>
-              <w:bottom w:val="single" w:color="BFC9CD" w:sz="4"/>
-              <w:right w:val="single" w:color="BFC9CD" w:sz="4"/>
-            </w:tcBorders>
-            <w:tcMar>
-              <w:top w:type="dxa" w:w="70"/>
-              <w:left w:type="dxa" w:w="110"/>
-              <w:bottom w:type="dxa" w:w="70"/>
-              <w:right w:type="dxa" w:w="110"/>
-            </w:tcMar>
-          </w:tcPr>
-          <w:p>
-            <w:pPr>
-              <w:keepNext w:val="false"/>
-            </w:pPr>
-            <w:r>
-              <w:rPr>
-                <w:rFonts w:ascii="Arial" w:cs="Arial" w:eastAsia="Arial" w:hAnsi="Arial"/>
-                <w:b w:val="false"/>
-                <w:bCs w:val="false"/>
-                <w:color w:val="222222"/>
-                <w:sz w:val="19"/>
-                <w:szCs w:val="19"/>
-              </w:rPr>
-              <w:t xml:space="preserve">Ein Stack pro Treffer. Alle Boni werden am Rundenende entfernt</w:t>
+              <w:t xml:space="preserve">Das Augment ersetzt sich selbst. Die neuen Augments werden aus dem Pool entfernt und bekommen den Titelzusatz „Infect and Mutate:“</w:t>
             </w:r>
           </w:p>
         </w:tc>
@@ -8979,7 +9291,7 @@
         <w:rPr>
           <w:rFonts w:ascii="Arial" w:cs="Arial" w:eastAsia="Arial" w:hAnsi="Arial"/>
         </w:rPr>
-        <w:t xml:space="preserve">Stride of the Fray</w:t>
+        <w:t xml:space="preserve">Master of Trifactor</w:t>
       </w:r>
     </w:p>
     <w:p>
@@ -8990,7 +9302,7 @@
         <w:rPr>
           <w:rFonts w:ascii="Arial" w:cs="Arial" w:eastAsia="Arial" w:hAnsi="Arial"/>
         </w:rPr>
-        <w:t xml:space="preserve">Treffer machen schneller, Movement Speed wird teilweise zu Attack Speed.</w:t>
+        <w:t xml:space="preserve">Jeder Treffer stärkt die beiden anderen Schadensarten.</w:t>
       </w:r>
     </w:p>
     <w:p>
@@ -9060,7 +9372,7 @@
                 <w:sz w:val="21"/>
                 <w:szCs w:val="21"/>
               </w:rPr>
-              <w:t xml:space="preserve">Gain Movementspeed on each hit. Gain Attackspeed based of your movementspeed. Resets each Round</w:t>
+              <w:t xml:space="preserve">Gain infinitely stacking melee, mystic and ranged damage, depending on weapon type. Stacks infinitely. Resets each round</w:t>
             </w:r>
           </w:p>
         </w:tc>
@@ -9231,7 +9543,7 @@
                 <w:sz w:val="19"/>
                 <w:szCs w:val="19"/>
               </w:rPr>
-              <w:t xml:space="preserve">Movement Speed</w:t>
+              <w:t xml:space="preserve">Melee Damage</w:t>
             </w:r>
           </w:p>
         </w:tc>
@@ -9264,7 +9576,7 @@
                 <w:sz w:val="19"/>
                 <w:szCs w:val="19"/>
               </w:rPr>
-              <w:t xml:space="preserve">+1 pro Treffer</w:t>
+              <w:t xml:space="preserve">+1 pro Stack</w:t>
             </w:r>
           </w:p>
         </w:tc>
@@ -9297,7 +9609,656 @@
                 <w:sz w:val="19"/>
                 <w:szCs w:val="19"/>
               </w:rPr>
-              <w:t xml:space="preserve">Pro Stack. Zählt bei Treffern mit Waffen, die nicht vom Typ Ability sind</w:t>
+              <w:t xml:space="preserve">Bei Treffern mit einer Ranged- oder Mystic-Waffe</w:t>
+            </w:r>
+          </w:p>
+        </w:tc>
+      </w:tr>
+      <w:tr>
+        <w:trPr>
+          <w:cantSplit/>
+        </w:trPr>
+        <w:tc>
+          <w:tcPr>
+            <w:tcW w:type="dxa" w:w="2650"/>
+            <w:tcBorders>
+              <w:top w:val="single" w:color="BFC9CD" w:sz="4"/>
+              <w:left w:val="single" w:color="BFC9CD" w:sz="4"/>
+              <w:bottom w:val="single" w:color="BFC9CD" w:sz="4"/>
+              <w:right w:val="single" w:color="BFC9CD" w:sz="4"/>
+            </w:tcBorders>
+            <w:tcMar>
+              <w:top w:type="dxa" w:w="70"/>
+              <w:left w:type="dxa" w:w="110"/>
+              <w:bottom w:type="dxa" w:w="70"/>
+              <w:right w:type="dxa" w:w="110"/>
+            </w:tcMar>
+          </w:tcPr>
+          <w:p>
+            <w:pPr>
+              <w:keepNext/>
+            </w:pPr>
+            <w:r>
+              <w:rPr>
+                <w:rFonts w:ascii="Arial" w:cs="Arial" w:eastAsia="Arial" w:hAnsi="Arial"/>
+                <w:b/>
+                <w:bCs/>
+                <w:color w:val="222222"/>
+                <w:sz w:val="19"/>
+                <w:szCs w:val="19"/>
+              </w:rPr>
+              <w:t xml:space="preserve">Ranged Damage</w:t>
+            </w:r>
+          </w:p>
+        </w:tc>
+        <w:tc>
+          <w:tcPr>
+            <w:tcW w:type="dxa" w:w="2450"/>
+            <w:tcBorders>
+              <w:top w:val="single" w:color="BFC9CD" w:sz="4"/>
+              <w:left w:val="single" w:color="BFC9CD" w:sz="4"/>
+              <w:bottom w:val="single" w:color="BFC9CD" w:sz="4"/>
+              <w:right w:val="single" w:color="BFC9CD" w:sz="4"/>
+            </w:tcBorders>
+            <w:tcMar>
+              <w:top w:type="dxa" w:w="70"/>
+              <w:left w:type="dxa" w:w="110"/>
+              <w:bottom w:type="dxa" w:w="70"/>
+              <w:right w:type="dxa" w:w="110"/>
+            </w:tcMar>
+          </w:tcPr>
+          <w:p>
+            <w:pPr>
+              <w:keepNext/>
+            </w:pPr>
+            <w:r>
+              <w:rPr>
+                <w:rFonts w:ascii="Arial" w:cs="Arial" w:eastAsia="Arial" w:hAnsi="Arial"/>
+                <w:b/>
+                <w:bCs/>
+                <w:color w:val="222222"/>
+                <w:sz w:val="19"/>
+                <w:szCs w:val="19"/>
+              </w:rPr>
+              <w:t xml:space="preserve">+1 pro Stack</w:t>
+            </w:r>
+          </w:p>
+        </w:tc>
+        <w:tc>
+          <w:tcPr>
+            <w:tcW w:type="dxa" w:w="4538"/>
+            <w:tcBorders>
+              <w:top w:val="single" w:color="BFC9CD" w:sz="4"/>
+              <w:left w:val="single" w:color="BFC9CD" w:sz="4"/>
+              <w:bottom w:val="single" w:color="BFC9CD" w:sz="4"/>
+              <w:right w:val="single" w:color="BFC9CD" w:sz="4"/>
+            </w:tcBorders>
+            <w:tcMar>
+              <w:top w:type="dxa" w:w="70"/>
+              <w:left w:type="dxa" w:w="110"/>
+              <w:bottom w:type="dxa" w:w="70"/>
+              <w:right w:type="dxa" w:w="110"/>
+            </w:tcMar>
+          </w:tcPr>
+          <w:p>
+            <w:pPr>
+              <w:keepNext/>
+            </w:pPr>
+            <w:r>
+              <w:rPr>
+                <w:rFonts w:ascii="Arial" w:cs="Arial" w:eastAsia="Arial" w:hAnsi="Arial"/>
+                <w:b w:val="false"/>
+                <w:bCs w:val="false"/>
+                <w:color w:val="222222"/>
+                <w:sz w:val="19"/>
+                <w:szCs w:val="19"/>
+              </w:rPr>
+              <w:t xml:space="preserve">Bei Treffern mit einer Melee- oder Mystic-Waffe</w:t>
+            </w:r>
+          </w:p>
+        </w:tc>
+      </w:tr>
+      <w:tr>
+        <w:trPr>
+          <w:cantSplit/>
+        </w:trPr>
+        <w:tc>
+          <w:tcPr>
+            <w:tcW w:type="dxa" w:w="2650"/>
+            <w:tcBorders>
+              <w:top w:val="single" w:color="BFC9CD" w:sz="4"/>
+              <w:left w:val="single" w:color="BFC9CD" w:sz="4"/>
+              <w:bottom w:val="single" w:color="BFC9CD" w:sz="4"/>
+              <w:right w:val="single" w:color="BFC9CD" w:sz="4"/>
+            </w:tcBorders>
+            <w:tcMar>
+              <w:top w:type="dxa" w:w="70"/>
+              <w:left w:type="dxa" w:w="110"/>
+              <w:bottom w:type="dxa" w:w="70"/>
+              <w:right w:type="dxa" w:w="110"/>
+            </w:tcMar>
+          </w:tcPr>
+          <w:p>
+            <w:pPr>
+              <w:keepNext/>
+            </w:pPr>
+            <w:r>
+              <w:rPr>
+                <w:rFonts w:ascii="Arial" w:cs="Arial" w:eastAsia="Arial" w:hAnsi="Arial"/>
+                <w:b/>
+                <w:bCs/>
+                <w:color w:val="222222"/>
+                <w:sz w:val="19"/>
+                <w:szCs w:val="19"/>
+              </w:rPr>
+              <w:t xml:space="preserve">Mystic Damage</w:t>
+            </w:r>
+          </w:p>
+        </w:tc>
+        <w:tc>
+          <w:tcPr>
+            <w:tcW w:type="dxa" w:w="2450"/>
+            <w:tcBorders>
+              <w:top w:val="single" w:color="BFC9CD" w:sz="4"/>
+              <w:left w:val="single" w:color="BFC9CD" w:sz="4"/>
+              <w:bottom w:val="single" w:color="BFC9CD" w:sz="4"/>
+              <w:right w:val="single" w:color="BFC9CD" w:sz="4"/>
+            </w:tcBorders>
+            <w:tcMar>
+              <w:top w:type="dxa" w:w="70"/>
+              <w:left w:type="dxa" w:w="110"/>
+              <w:bottom w:type="dxa" w:w="70"/>
+              <w:right w:type="dxa" w:w="110"/>
+            </w:tcMar>
+          </w:tcPr>
+          <w:p>
+            <w:pPr>
+              <w:keepNext/>
+            </w:pPr>
+            <w:r>
+              <w:rPr>
+                <w:rFonts w:ascii="Arial" w:cs="Arial" w:eastAsia="Arial" w:hAnsi="Arial"/>
+                <w:b/>
+                <w:bCs/>
+                <w:color w:val="222222"/>
+                <w:sz w:val="19"/>
+                <w:szCs w:val="19"/>
+              </w:rPr>
+              <w:t xml:space="preserve">+1 pro Stack</w:t>
+            </w:r>
+          </w:p>
+        </w:tc>
+        <w:tc>
+          <w:tcPr>
+            <w:tcW w:type="dxa" w:w="4538"/>
+            <w:tcBorders>
+              <w:top w:val="single" w:color="BFC9CD" w:sz="4"/>
+              <w:left w:val="single" w:color="BFC9CD" w:sz="4"/>
+              <w:bottom w:val="single" w:color="BFC9CD" w:sz="4"/>
+              <w:right w:val="single" w:color="BFC9CD" w:sz="4"/>
+            </w:tcBorders>
+            <w:tcMar>
+              <w:top w:type="dxa" w:w="70"/>
+              <w:left w:type="dxa" w:w="110"/>
+              <w:bottom w:type="dxa" w:w="70"/>
+              <w:right w:type="dxa" w:w="110"/>
+            </w:tcMar>
+          </w:tcPr>
+          <w:p>
+            <w:pPr>
+              <w:keepNext/>
+            </w:pPr>
+            <w:r>
+              <w:rPr>
+                <w:rFonts w:ascii="Arial" w:cs="Arial" w:eastAsia="Arial" w:hAnsi="Arial"/>
+                <w:b w:val="false"/>
+                <w:bCs w:val="false"/>
+                <w:color w:val="222222"/>
+                <w:sz w:val="19"/>
+                <w:szCs w:val="19"/>
+              </w:rPr>
+              <w:t xml:space="preserve">Bei Treffern mit einer Melee- oder Ranged-Waffe</w:t>
+            </w:r>
+          </w:p>
+        </w:tc>
+      </w:tr>
+      <w:tr>
+        <w:trPr>
+          <w:cantSplit/>
+        </w:trPr>
+        <w:tc>
+          <w:tcPr>
+            <w:tcW w:type="dxa" w:w="2650"/>
+            <w:tcBorders>
+              <w:top w:val="single" w:color="BFC9CD" w:sz="4"/>
+              <w:left w:val="single" w:color="BFC9CD" w:sz="4"/>
+              <w:bottom w:val="single" w:color="BFC9CD" w:sz="4"/>
+              <w:right w:val="single" w:color="BFC9CD" w:sz="4"/>
+            </w:tcBorders>
+            <w:tcMar>
+              <w:top w:type="dxa" w:w="70"/>
+              <w:left w:type="dxa" w:w="110"/>
+              <w:bottom w:type="dxa" w:w="70"/>
+              <w:right w:type="dxa" w:w="110"/>
+            </w:tcMar>
+          </w:tcPr>
+          <w:p>
+            <w:pPr>
+              <w:keepNext w:val="false"/>
+            </w:pPr>
+            <w:r>
+              <w:rPr>
+                <w:rFonts w:ascii="Arial" w:cs="Arial" w:eastAsia="Arial" w:hAnsi="Arial"/>
+                <w:b/>
+                <w:bCs/>
+                <w:color w:val="222222"/>
+                <w:sz w:val="19"/>
+                <w:szCs w:val="19"/>
+              </w:rPr>
+              <w:t xml:space="preserve">Stack-Limit</w:t>
+            </w:r>
+          </w:p>
+        </w:tc>
+        <w:tc>
+          <w:tcPr>
+            <w:tcW w:type="dxa" w:w="2450"/>
+            <w:tcBorders>
+              <w:top w:val="single" w:color="BFC9CD" w:sz="4"/>
+              <w:left w:val="single" w:color="BFC9CD" w:sz="4"/>
+              <w:bottom w:val="single" w:color="BFC9CD" w:sz="4"/>
+              <w:right w:val="single" w:color="BFC9CD" w:sz="4"/>
+            </w:tcBorders>
+            <w:tcMar>
+              <w:top w:type="dxa" w:w="70"/>
+              <w:left w:type="dxa" w:w="110"/>
+              <w:bottom w:type="dxa" w:w="70"/>
+              <w:right w:type="dxa" w:w="110"/>
+            </w:tcMar>
+          </w:tcPr>
+          <w:p>
+            <w:pPr>
+              <w:keepNext w:val="false"/>
+            </w:pPr>
+            <w:r>
+              <w:rPr>
+                <w:rFonts w:ascii="Arial" w:cs="Arial" w:eastAsia="Arial" w:hAnsi="Arial"/>
+                <w:b/>
+                <w:bCs/>
+                <w:color w:val="222222"/>
+                <w:sz w:val="19"/>
+                <w:szCs w:val="19"/>
+              </w:rPr>
+              <w:t xml:space="preserve">unbegrenzt</w:t>
+            </w:r>
+          </w:p>
+        </w:tc>
+        <w:tc>
+          <w:tcPr>
+            <w:tcW w:type="dxa" w:w="4538"/>
+            <w:tcBorders>
+              <w:top w:val="single" w:color="BFC9CD" w:sz="4"/>
+              <w:left w:val="single" w:color="BFC9CD" w:sz="4"/>
+              <w:bottom w:val="single" w:color="BFC9CD" w:sz="4"/>
+              <w:right w:val="single" w:color="BFC9CD" w:sz="4"/>
+            </w:tcBorders>
+            <w:tcMar>
+              <w:top w:type="dxa" w:w="70"/>
+              <w:left w:type="dxa" w:w="110"/>
+              <w:bottom w:type="dxa" w:w="70"/>
+              <w:right w:type="dxa" w:w="110"/>
+            </w:tcMar>
+          </w:tcPr>
+          <w:p>
+            <w:pPr>
+              <w:keepNext w:val="false"/>
+            </w:pPr>
+            <w:r>
+              <w:rPr>
+                <w:rFonts w:ascii="Arial" w:cs="Arial" w:eastAsia="Arial" w:hAnsi="Arial"/>
+                <w:b w:val="false"/>
+                <w:bCs w:val="false"/>
+                <w:color w:val="222222"/>
+                <w:sz w:val="19"/>
+                <w:szCs w:val="19"/>
+              </w:rPr>
+              <w:t xml:space="preserve">Ein Stack pro Waffentreffer. Abilities und Effekte (z. B. Bleed) zählen nicht. Alle Boni werden am Rundenende entfernt</w:t>
+            </w:r>
+          </w:p>
+        </w:tc>
+      </w:tr>
+    </w:tbl>
+    <w:p>
+      <w:pPr>
+        <w:spacing w:after="120"/>
+      </w:pPr>
+    </w:p>
+    <w:p>
+      <w:pPr>
+        <w:pStyle w:val="Heading1"/>
+      </w:pPr>
+      <w:r>
+        <w:rPr>
+          <w:rFonts w:ascii="Arial" w:cs="Arial" w:eastAsia="Arial" w:hAnsi="Arial"/>
+        </w:rPr>
+        <w:t xml:space="preserve">Stride of the Fray</w:t>
+      </w:r>
+    </w:p>
+    <w:p>
+      <w:pPr>
+        <w:pStyle w:val="Heading2"/>
+      </w:pPr>
+      <w:r>
+        <w:rPr>
+          <w:rFonts w:ascii="Arial" w:cs="Arial" w:eastAsia="Arial" w:hAnsi="Arial"/>
+        </w:rPr>
+        <w:t xml:space="preserve">Treffer machen schneller, Movement Speed wird teilweise zu Attack Speed.</w:t>
+      </w:r>
+    </w:p>
+    <w:p>
+      <w:pPr>
+        <w:keepNext/>
+        <w:spacing w:after="60" w:before="60"/>
+      </w:pPr>
+      <w:r>
+        <w:rPr>
+          <w:rFonts w:ascii="Arial" w:cs="Arial" w:eastAsia="Arial" w:hAnsi="Arial"/>
+          <w:b/>
+          <w:bCs/>
+          <w:color w:val="5A6B72"/>
+          <w:spacing w:val="20"/>
+          <w:sz w:val="15"/>
+          <w:szCs w:val="15"/>
+        </w:rPr>
+        <w:t xml:space="preserve">ANZEIGETEXT IM SPIEL</w:t>
+      </w:r>
+    </w:p>
+    <w:tbl>
+      <w:tblPr>
+        <w:tblW w:type="dxa" w:w="9638"/>
+        <w:tblBorders>
+          <w:top w:val="single" w:color="auto" w:sz="4"/>
+          <w:left w:val="single" w:color="auto" w:sz="4"/>
+          <w:bottom w:val="single" w:color="auto" w:sz="4"/>
+          <w:right w:val="single" w:color="auto" w:sz="4"/>
+          <w:insideH w:val="single" w:color="auto" w:sz="4"/>
+          <w:insideV w:val="single" w:color="auto" w:sz="4"/>
+        </w:tblBorders>
+        <w:tblLayout w:type="fixed"/>
+      </w:tblPr>
+      <w:tblGrid>
+        <w:gridCol w:w="9638"/>
+      </w:tblGrid>
+      <w:tr>
+        <w:trPr>
+          <w:cantSplit/>
+        </w:trPr>
+        <w:tc>
+          <w:tcPr>
+            <w:tcW w:type="dxa" w:w="9638"/>
+            <w:tcBorders>
+              <w:top w:val="none" w:color="auto" w:sz="0"/>
+              <w:left w:val="single" w:color="58B1C2" w:sz="24"/>
+              <w:bottom w:val="none" w:color="auto" w:sz="0"/>
+              <w:right w:val="none" w:color="auto" w:sz="0"/>
+            </w:tcBorders>
+            <w:shd w:fill="1F2A30" w:color="auto" w:val="clear"/>
+            <w:tcMar>
+              <w:top w:type="dxa" w:w="120"/>
+              <w:left w:type="dxa" w:w="200"/>
+              <w:bottom w:type="dxa" w:w="120"/>
+              <w:right w:type="dxa" w:w="200"/>
+            </w:tcMar>
+          </w:tcPr>
+          <w:p>
+            <w:pPr>
+              <w:keepNext/>
+              <w:spacing w:line="300"/>
+            </w:pPr>
+            <w:r>
+              <w:rPr>
+                <w:rFonts w:ascii="Arial" w:cs="Arial" w:eastAsia="Arial" w:hAnsi="Arial"/>
+                <w:color w:val="E8EEF0"/>
+                <w:sz w:val="21"/>
+                <w:szCs w:val="21"/>
+              </w:rPr>
+              <w:t xml:space="preserve">Gain Movementspeed on each hit. Gain Attackspeed based of your movementspeed. Resets each Round</w:t>
+            </w:r>
+          </w:p>
+        </w:tc>
+      </w:tr>
+    </w:tbl>
+    <w:p>
+      <w:pPr>
+        <w:keepNext/>
+        <w:spacing w:after="100" w:before="0"/>
+      </w:pPr>
+    </w:p>
+    <w:tbl>
+      <w:tblPr>
+        <w:tblW w:type="dxa" w:w="9638"/>
+        <w:tblBorders>
+          <w:top w:val="single" w:color="auto" w:sz="4"/>
+          <w:left w:val="single" w:color="auto" w:sz="4"/>
+          <w:bottom w:val="single" w:color="auto" w:sz="4"/>
+          <w:right w:val="single" w:color="auto" w:sz="4"/>
+          <w:insideH w:val="single" w:color="auto" w:sz="4"/>
+          <w:insideV w:val="single" w:color="auto" w:sz="4"/>
+        </w:tblBorders>
+        <w:tblLayout w:type="fixed"/>
+      </w:tblPr>
+      <w:tblGrid>
+        <w:gridCol w:w="2650"/>
+        <w:gridCol w:w="2450"/>
+        <w:gridCol w:w="4538"/>
+      </w:tblGrid>
+      <w:tr>
+        <w:trPr>
+          <w:cantSplit/>
+          <w:tblHeader/>
+        </w:trPr>
+        <w:tc>
+          <w:tcPr>
+            <w:tcW w:type="dxa" w:w="2650"/>
+            <w:tcBorders>
+              <w:top w:val="single" w:color="BFC9CD" w:sz="4"/>
+              <w:left w:val="single" w:color="BFC9CD" w:sz="4"/>
+              <w:bottom w:val="single" w:color="BFC9CD" w:sz="4"/>
+              <w:right w:val="single" w:color="BFC9CD" w:sz="4"/>
+            </w:tcBorders>
+            <w:shd w:fill="1F7A8C" w:color="auto" w:val="clear"/>
+            <w:tcMar>
+              <w:top w:type="dxa" w:w="70"/>
+              <w:left w:type="dxa" w:w="110"/>
+              <w:bottom w:type="dxa" w:w="70"/>
+              <w:right w:type="dxa" w:w="110"/>
+            </w:tcMar>
+          </w:tcPr>
+          <w:p>
+            <w:pPr>
+              <w:keepNext/>
+            </w:pPr>
+            <w:r>
+              <w:rPr>
+                <w:rFonts w:ascii="Arial" w:cs="Arial" w:eastAsia="Arial" w:hAnsi="Arial"/>
+                <w:b/>
+                <w:bCs/>
+                <w:color w:val="FFFFFF"/>
+                <w:sz w:val="19"/>
+                <w:szCs w:val="19"/>
+              </w:rPr>
+              <w:t xml:space="preserve">Wert</w:t>
+            </w:r>
+          </w:p>
+        </w:tc>
+        <w:tc>
+          <w:tcPr>
+            <w:tcW w:type="dxa" w:w="2450"/>
+            <w:tcBorders>
+              <w:top w:val="single" w:color="BFC9CD" w:sz="4"/>
+              <w:left w:val="single" w:color="BFC9CD" w:sz="4"/>
+              <w:bottom w:val="single" w:color="BFC9CD" w:sz="4"/>
+              <w:right w:val="single" w:color="BFC9CD" w:sz="4"/>
+            </w:tcBorders>
+            <w:shd w:fill="1F7A8C" w:color="auto" w:val="clear"/>
+            <w:tcMar>
+              <w:top w:type="dxa" w:w="70"/>
+              <w:left w:type="dxa" w:w="110"/>
+              <w:bottom w:type="dxa" w:w="70"/>
+              <w:right w:type="dxa" w:w="110"/>
+            </w:tcMar>
+          </w:tcPr>
+          <w:p>
+            <w:pPr>
+              <w:keepNext/>
+            </w:pPr>
+            <w:r>
+              <w:rPr>
+                <w:rFonts w:ascii="Arial" w:cs="Arial" w:eastAsia="Arial" w:hAnsi="Arial"/>
+                <w:b/>
+                <w:bCs/>
+                <w:color w:val="FFFFFF"/>
+                <w:sz w:val="19"/>
+                <w:szCs w:val="19"/>
+              </w:rPr>
+              <w:t xml:space="preserve">Betrag</w:t>
+            </w:r>
+          </w:p>
+        </w:tc>
+        <w:tc>
+          <w:tcPr>
+            <w:tcW w:type="dxa" w:w="4538"/>
+            <w:tcBorders>
+              <w:top w:val="single" w:color="BFC9CD" w:sz="4"/>
+              <w:left w:val="single" w:color="BFC9CD" w:sz="4"/>
+              <w:bottom w:val="single" w:color="BFC9CD" w:sz="4"/>
+              <w:right w:val="single" w:color="BFC9CD" w:sz="4"/>
+            </w:tcBorders>
+            <w:shd w:fill="1F7A8C" w:color="auto" w:val="clear"/>
+            <w:tcMar>
+              <w:top w:type="dxa" w:w="70"/>
+              <w:left w:type="dxa" w:w="110"/>
+              <w:bottom w:type="dxa" w:w="70"/>
+              <w:right w:type="dxa" w:w="110"/>
+            </w:tcMar>
+          </w:tcPr>
+          <w:p>
+            <w:pPr>
+              <w:keepNext/>
+            </w:pPr>
+            <w:r>
+              <w:rPr>
+                <w:rFonts w:ascii="Arial" w:cs="Arial" w:eastAsia="Arial" w:hAnsi="Arial"/>
+                <w:b/>
+                <w:bCs/>
+                <w:color w:val="FFFFFF"/>
+                <w:sz w:val="19"/>
+                <w:szCs w:val="19"/>
+              </w:rPr>
+              <w:t xml:space="preserve">Anmerkung</w:t>
+            </w:r>
+          </w:p>
+        </w:tc>
+      </w:tr>
+      <w:tr>
+        <w:trPr>
+          <w:cantSplit/>
+        </w:trPr>
+        <w:tc>
+          <w:tcPr>
+            <w:tcW w:type="dxa" w:w="2650"/>
+            <w:tcBorders>
+              <w:top w:val="single" w:color="BFC9CD" w:sz="4"/>
+              <w:left w:val="single" w:color="BFC9CD" w:sz="4"/>
+              <w:bottom w:val="single" w:color="BFC9CD" w:sz="4"/>
+              <w:right w:val="single" w:color="BFC9CD" w:sz="4"/>
+            </w:tcBorders>
+            <w:tcMar>
+              <w:top w:type="dxa" w:w="70"/>
+              <w:left w:type="dxa" w:w="110"/>
+              <w:bottom w:type="dxa" w:w="70"/>
+              <w:right w:type="dxa" w:w="110"/>
+            </w:tcMar>
+          </w:tcPr>
+          <w:p>
+            <w:pPr>
+              <w:keepNext/>
+            </w:pPr>
+            <w:r>
+              <w:rPr>
+                <w:rFonts w:ascii="Arial" w:cs="Arial" w:eastAsia="Arial" w:hAnsi="Arial"/>
+                <w:b/>
+                <w:bCs/>
+                <w:color w:val="222222"/>
+                <w:sz w:val="19"/>
+                <w:szCs w:val="19"/>
+              </w:rPr>
+              <w:t xml:space="preserve">Movement Speed</w:t>
+            </w:r>
+          </w:p>
+        </w:tc>
+        <w:tc>
+          <w:tcPr>
+            <w:tcW w:type="dxa" w:w="2450"/>
+            <w:tcBorders>
+              <w:top w:val="single" w:color="BFC9CD" w:sz="4"/>
+              <w:left w:val="single" w:color="BFC9CD" w:sz="4"/>
+              <w:bottom w:val="single" w:color="BFC9CD" w:sz="4"/>
+              <w:right w:val="single" w:color="BFC9CD" w:sz="4"/>
+            </w:tcBorders>
+            <w:tcMar>
+              <w:top w:type="dxa" w:w="70"/>
+              <w:left w:type="dxa" w:w="110"/>
+              <w:bottom w:type="dxa" w:w="70"/>
+              <w:right w:type="dxa" w:w="110"/>
+            </w:tcMar>
+          </w:tcPr>
+          <w:p>
+            <w:pPr>
+              <w:keepNext/>
+            </w:pPr>
+            <w:r>
+              <w:rPr>
+                <w:rFonts w:ascii="Arial" w:cs="Arial" w:eastAsia="Arial" w:hAnsi="Arial"/>
+                <w:b/>
+                <w:bCs/>
+                <w:color w:val="222222"/>
+                <w:sz w:val="19"/>
+                <w:szCs w:val="19"/>
+              </w:rPr>
+              <w:t xml:space="preserve">+1 pro Treffer</w:t>
+            </w:r>
+          </w:p>
+        </w:tc>
+        <w:tc>
+          <w:tcPr>
+            <w:tcW w:type="dxa" w:w="4538"/>
+            <w:tcBorders>
+              <w:top w:val="single" w:color="BFC9CD" w:sz="4"/>
+              <w:left w:val="single" w:color="BFC9CD" w:sz="4"/>
+              <w:bottom w:val="single" w:color="BFC9CD" w:sz="4"/>
+              <w:right w:val="single" w:color="BFC9CD" w:sz="4"/>
+            </w:tcBorders>
+            <w:tcMar>
+              <w:top w:type="dxa" w:w="70"/>
+              <w:left w:type="dxa" w:w="110"/>
+              <w:bottom w:type="dxa" w:w="70"/>
+              <w:right w:type="dxa" w:w="110"/>
+            </w:tcMar>
+          </w:tcPr>
+          <w:p>
+            <w:pPr>
+              <w:keepNext/>
+            </w:pPr>
+            <w:r>
+              <w:rPr>
+                <w:rFonts w:ascii="Arial" w:cs="Arial" w:eastAsia="Arial" w:hAnsi="Arial"/>
+                <w:b w:val="false"/>
+                <w:bCs w:val="false"/>
+                <w:color w:val="222222"/>
+                <w:sz w:val="19"/>
+                <w:szCs w:val="19"/>
+              </w:rPr>
+              <w:t xml:space="preserve">Pro Stack. Zählt bei Treffern mit Melee-, Ranged- und Mystic-Waffen, nicht bei Abilities und Effekten (z. B. Bleed)</w:t>
             </w:r>
           </w:p>
         </w:tc>

</xml_diff>